<commit_message>
Add Slaves 3-10 shot clock, fouls, and quarter display firmware
- Slave 3 v6-v10: shot clock top row (v10 = split-digit final)
- Slave 4 v1-v3: shot clock bottom row (v3 = split-digit final)
- Slave 5/6 v1.0: Fouls Team A top/bottom split-digit display
- Slave 7/8 v1.0: Fouls Team B top/bottom split-digit display
- Slave 9/10 v1.0: Quarter top/bottom split-digit display (OT for q>=5)
- Remove esp32_slave1_static_test
- Update master and misc files

Co-Authored-By: Claude Sonnet 4.6 <noreply@anthropic.com>
</commit_message>
<xml_diff>
--- a/MAC ADDRESS.docx
+++ b/MAC ADDRESS.docx
@@ -3,8 +3,714 @@
 <w:document xmlns:wpc="http://schemas.microsoft.com/office/word/2010/wordprocessingCanvas" xmlns:cx="http://schemas.microsoft.com/office/drawing/2014/chartex" xmlns:cx1="http://schemas.microsoft.com/office/drawing/2015/9/8/chartex" xmlns:mc="http://schemas.openxmlformats.org/markup-compatibility/2006" xmlns:o="urn:schemas-microsoft-com:office:office" xmlns:r="http://schemas.openxmlformats.org/officeDocument/2006/relationships" xmlns:m="http://schemas.openxmlformats.org/officeDocument/2006/math" xmlns:v="urn:schemas-microsoft-com:vml" xmlns:wp14="http://schemas.microsoft.com/office/word/2010/wordprocessingDrawing" xmlns:wp="http://schemas.openxmlformats.org/drawingml/2006/wordprocessingDrawing" xmlns:w10="urn:schemas-microsoft-com:office:word" xmlns:w="http://schemas.openxmlformats.org/wordprocessingml/2006/main" xmlns:w14="http://schemas.microsoft.com/office/word/2010/wordml" xmlns:w15="http://schemas.microsoft.com/office/word/2012/wordml" xmlns:w16se="http://schemas.microsoft.com/office/word/2015/wordml/symex" xmlns:wpg="http://schemas.microsoft.com/office/word/2010/wordprocessingGroup" xmlns:wpi="http://schemas.microsoft.com/office/word/2010/wordprocessingInk" xmlns:wne="http://schemas.microsoft.com/office/word/2006/wordml" xmlns:wps="http://schemas.microsoft.com/office/word/2010/wordprocessingShape" mc:Ignorable="w14 w15 w16se wp14">
   <w:body>
     <w:p>
-      <w:bookmarkStart w:id="0" w:name="_GoBack"/>
-      <w:bookmarkEnd w:id="0"/>
+      <w:r>
+        <w:rPr>
+          <w:noProof/>
+          <w:lang w:eastAsia="en-IN"/>
+        </w:rPr>
+        <mc:AlternateContent>
+          <mc:Choice Requires="wps">
+            <w:drawing>
+              <wp:anchor distT="0" distB="0" distL="114300" distR="114300" simplePos="0" relativeHeight="251663360" behindDoc="0" locked="0" layoutInCell="1" allowOverlap="1" wp14:anchorId="69B70F84" wp14:editId="2EDB1D1C">
+                <wp:simplePos x="0" y="0"/>
+                <wp:positionH relativeFrom="column">
+                  <wp:posOffset>2487378</wp:posOffset>
+                </wp:positionH>
+                <wp:positionV relativeFrom="paragraph">
+                  <wp:posOffset>1803903</wp:posOffset>
+                </wp:positionV>
+                <wp:extent cx="1952625" cy="1181100"/>
+                <wp:effectExtent l="0" t="0" r="28575" b="19050"/>
+                <wp:wrapNone/>
+                <wp:docPr id="3" name="Rounded Rectangle 3"/>
+                <wp:cNvGraphicFramePr/>
+                <a:graphic xmlns:a="http://schemas.openxmlformats.org/drawingml/2006/main">
+                  <a:graphicData uri="http://schemas.microsoft.com/office/word/2010/wordprocessingShape">
+                    <wps:wsp>
+                      <wps:cNvSpPr/>
+                      <wps:spPr>
+                        <a:xfrm>
+                          <a:off x="0" y="0"/>
+                          <a:ext cx="1952625" cy="1181100"/>
+                        </a:xfrm>
+                        <a:prstGeom prst="roundRect">
+                          <a:avLst/>
+                        </a:prstGeom>
+                        <a:ln>
+                          <a:solidFill>
+                            <a:schemeClr val="tx1"/>
+                          </a:solidFill>
+                        </a:ln>
+                      </wps:spPr>
+                      <wps:style>
+                        <a:lnRef idx="2">
+                          <a:schemeClr val="dk1">
+                            <a:shade val="50000"/>
+                          </a:schemeClr>
+                        </a:lnRef>
+                        <a:fillRef idx="1">
+                          <a:schemeClr val="dk1"/>
+                        </a:fillRef>
+                        <a:effectRef idx="0">
+                          <a:schemeClr val="dk1"/>
+                        </a:effectRef>
+                        <a:fontRef idx="minor">
+                          <a:schemeClr val="lt1"/>
+                        </a:fontRef>
+                      </wps:style>
+                      <wps:txbx>
+                        <w:txbxContent>
+                          <w:p>
+                            <w:pPr>
+                              <w:shd w:val="clear" w:color="auto" w:fill="1F272A"/>
+                              <w:tabs>
+                                <w:tab w:val="left" w:pos="916"/>
+                                <w:tab w:val="left" w:pos="1832"/>
+                                <w:tab w:val="left" w:pos="2748"/>
+                                <w:tab w:val="left" w:pos="3664"/>
+                                <w:tab w:val="left" w:pos="4580"/>
+                                <w:tab w:val="left" w:pos="5496"/>
+                                <w:tab w:val="left" w:pos="6412"/>
+                                <w:tab w:val="left" w:pos="7328"/>
+                                <w:tab w:val="left" w:pos="8244"/>
+                                <w:tab w:val="left" w:pos="9160"/>
+                                <w:tab w:val="left" w:pos="10076"/>
+                                <w:tab w:val="left" w:pos="10992"/>
+                                <w:tab w:val="left" w:pos="11908"/>
+                                <w:tab w:val="left" w:pos="12824"/>
+                                <w:tab w:val="left" w:pos="13740"/>
+                                <w:tab w:val="left" w:pos="14656"/>
+                              </w:tabs>
+                              <w:spacing w:after="0" w:line="240" w:lineRule="auto"/>
+                              <w:jc w:val="center"/>
+                              <w:rPr>
+                                <w:rFonts w:ascii="Courier New" w:eastAsia="Times New Roman" w:hAnsi="Courier New" w:cs="Courier New"/>
+                                <w:b/>
+                                <w:color w:val="FFFFFF" w:themeColor="background1"/>
+                                <w:spacing w:val="10"/>
+                                <w:sz w:val="44"/>
+                                <w:szCs w:val="20"/>
+                                <w:lang w:eastAsia="en-IN"/>
+                                <w14:shadow w14:blurRad="63500" w14:dist="50800" w14:dir="13500000" w14:sx="0" w14:sy="0" w14:kx="0" w14:ky="0" w14:algn="none">
+                                  <w14:srgbClr w14:val="000000">
+                                    <w14:alpha w14:val="50000"/>
+                                  </w14:srgbClr>
+                                </w14:shadow>
+                                <w14:textOutline w14:w="0" w14:cap="flat" w14:cmpd="sng" w14:algn="ctr">
+                                  <w14:noFill/>
+                                  <w14:prstDash w14:val="solid"/>
+                                  <w14:round/>
+                                </w14:textOutline>
+                              </w:rPr>
+                            </w:pPr>
+                            <w:r>
+                              <w:rPr>
+                                <w:rFonts w:ascii="Courier New" w:eastAsia="Times New Roman" w:hAnsi="Courier New" w:cs="Courier New"/>
+                                <w:b/>
+                                <w:color w:val="FFFFFF" w:themeColor="background1"/>
+                                <w:spacing w:val="10"/>
+                                <w:sz w:val="44"/>
+                                <w:szCs w:val="20"/>
+                                <w:lang w:eastAsia="en-IN"/>
+                                <w14:shadow w14:blurRad="63500" w14:dist="50800" w14:dir="13500000" w14:sx="0" w14:sy="0" w14:kx="0" w14:ky="0" w14:algn="none">
+                                  <w14:srgbClr w14:val="000000">
+                                    <w14:alpha w14:val="50000"/>
+                                  </w14:srgbClr>
+                                </w14:shadow>
+                                <w14:textOutline w14:w="0" w14:cap="flat" w14:cmpd="sng" w14:algn="ctr">
+                                  <w14:noFill/>
+                                  <w14:prstDash w14:val="solid"/>
+                                  <w14:round/>
+                                </w14:textOutline>
+                              </w:rPr>
+                              <w:t xml:space="preserve">S3 RGB </w:t>
+                            </w:r>
+                            <w:r>
+                              <w:rPr>
+                                <w:rFonts w:ascii="Courier New" w:eastAsia="Times New Roman" w:hAnsi="Courier New" w:cs="Courier New"/>
+                                <w:b/>
+                                <w:color w:val="FFFFFF" w:themeColor="background1"/>
+                                <w:spacing w:val="10"/>
+                                <w:sz w:val="44"/>
+                                <w:szCs w:val="20"/>
+                                <w:lang w:eastAsia="en-IN"/>
+                                <w14:shadow w14:blurRad="63500" w14:dist="50800" w14:dir="13500000" w14:sx="0" w14:sy="0" w14:kx="0" w14:ky="0" w14:algn="none">
+                                  <w14:srgbClr w14:val="000000">
+                                    <w14:alpha w14:val="50000"/>
+                                  </w14:srgbClr>
+                                </w14:shadow>
+                                <w14:textOutline w14:w="0" w14:cap="flat" w14:cmpd="sng" w14:algn="ctr">
+                                  <w14:noFill/>
+                                  <w14:prstDash w14:val="solid"/>
+                                  <w14:round/>
+                                </w14:textOutline>
+                              </w:rPr>
+                              <w:t xml:space="preserve">MAC: </w:t>
+                            </w:r>
+                            <w:r>
+                              <w:rPr>
+                                <w:rFonts w:ascii="Courier New" w:eastAsia="Times New Roman" w:hAnsi="Courier New" w:cs="Courier New"/>
+                                <w:b/>
+                                <w:color w:val="FFFFFF" w:themeColor="background1"/>
+                                <w:spacing w:val="10"/>
+                                <w:sz w:val="44"/>
+                                <w:szCs w:val="20"/>
+                                <w:lang w:eastAsia="en-IN"/>
+                                <w14:shadow w14:blurRad="63500" w14:dist="50800" w14:dir="13500000" w14:sx="0" w14:sy="0" w14:kx="0" w14:ky="0" w14:algn="none">
+                                  <w14:srgbClr w14:val="000000">
+                                    <w14:alpha w14:val="50000"/>
+                                  </w14:srgbClr>
+                                </w14:shadow>
+                                <w14:textOutline w14:w="0" w14:cap="flat" w14:cmpd="sng" w14:algn="ctr">
+                                  <w14:noFill/>
+                                  <w14:prstDash w14:val="solid"/>
+                                  <w14:round/>
+                                </w14:textOutline>
+                              </w:rPr>
+                              <w:t>8C:94:DF:90:AB:CC</w:t>
+                            </w:r>
+                          </w:p>
+                          <w:p>
+                            <w:pPr>
+                              <w:jc w:val="center"/>
+                              <w:rPr>
+                                <w:b/>
+                                <w:color w:val="FFFFFF" w:themeColor="background1"/>
+                                <w:spacing w:val="10"/>
+                                <w:sz w:val="14"/>
+                                <w14:shadow w14:blurRad="63500" w14:dist="50800" w14:dir="13500000" w14:sx="0" w14:sy="0" w14:kx="0" w14:ky="0" w14:algn="none">
+                                  <w14:srgbClr w14:val="000000">
+                                    <w14:alpha w14:val="50000"/>
+                                  </w14:srgbClr>
+                                </w14:shadow>
+                                <w14:textOutline w14:w="0" w14:cap="flat" w14:cmpd="sng" w14:algn="ctr">
+                                  <w14:noFill/>
+                                  <w14:prstDash w14:val="solid"/>
+                                  <w14:round/>
+                                </w14:textOutline>
+                              </w:rPr>
+                            </w:pPr>
+                          </w:p>
+                        </w:txbxContent>
+                      </wps:txbx>
+                      <wps:bodyPr rot="0" spcFirstLastPara="0" vertOverflow="overflow" horzOverflow="overflow" vert="horz" wrap="square" lIns="91440" tIns="45720" rIns="91440" bIns="45720" numCol="1" spcCol="0" rtlCol="0" fromWordArt="0" anchor="ctr" anchorCtr="0" forceAA="0" compatLnSpc="1">
+                        <a:prstTxWarp prst="textNoShape">
+                          <a:avLst/>
+                        </a:prstTxWarp>
+                        <a:noAutofit/>
+                      </wps:bodyPr>
+                    </wps:wsp>
+                  </a:graphicData>
+                </a:graphic>
+                <wp14:sizeRelH relativeFrom="margin">
+                  <wp14:pctWidth>0</wp14:pctWidth>
+                </wp14:sizeRelH>
+                <wp14:sizeRelV relativeFrom="margin">
+                  <wp14:pctHeight>0</wp14:pctHeight>
+                </wp14:sizeRelV>
+              </wp:anchor>
+            </w:drawing>
+          </mc:Choice>
+          <mc:Fallback>
+            <w:pict>
+              <v:roundrect w14:anchorId="69B70F84" id="Rounded Rectangle 3" o:spid="_x0000_s1026" style="position:absolute;margin-left:195.85pt;margin-top:142.05pt;width:153.75pt;height:93pt;z-index:251663360;visibility:visible;mso-wrap-style:square;mso-width-percent:0;mso-height-percent:0;mso-wrap-distance-left:9pt;mso-wrap-distance-top:0;mso-wrap-distance-right:9pt;mso-wrap-distance-bottom:0;mso-position-horizontal:absolute;mso-position-horizontal-relative:text;mso-position-vertical:absolute;mso-position-vertical-relative:text;mso-width-percent:0;mso-height-percent:0;mso-width-relative:margin;mso-height-relative:margin;v-text-anchor:middle" arcsize="10923f" o:gfxdata="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" fillcolor="black [3200]" strokecolor="black [3213]" strokeweight="1pt">
+                <v:stroke joinstyle="miter"/>
+                <v:textbox>
+                  <w:txbxContent>
+                    <w:p>
+                      <w:pPr>
+                        <w:shd w:val="clear" w:color="auto" w:fill="1F272A"/>
+                        <w:tabs>
+                          <w:tab w:val="left" w:pos="916"/>
+                          <w:tab w:val="left" w:pos="1832"/>
+                          <w:tab w:val="left" w:pos="2748"/>
+                          <w:tab w:val="left" w:pos="3664"/>
+                          <w:tab w:val="left" w:pos="4580"/>
+                          <w:tab w:val="left" w:pos="5496"/>
+                          <w:tab w:val="left" w:pos="6412"/>
+                          <w:tab w:val="left" w:pos="7328"/>
+                          <w:tab w:val="left" w:pos="8244"/>
+                          <w:tab w:val="left" w:pos="9160"/>
+                          <w:tab w:val="left" w:pos="10076"/>
+                          <w:tab w:val="left" w:pos="10992"/>
+                          <w:tab w:val="left" w:pos="11908"/>
+                          <w:tab w:val="left" w:pos="12824"/>
+                          <w:tab w:val="left" w:pos="13740"/>
+                          <w:tab w:val="left" w:pos="14656"/>
+                        </w:tabs>
+                        <w:spacing w:after="0" w:line="240" w:lineRule="auto"/>
+                        <w:jc w:val="center"/>
+                        <w:rPr>
+                          <w:rFonts w:ascii="Courier New" w:eastAsia="Times New Roman" w:hAnsi="Courier New" w:cs="Courier New"/>
+                          <w:b/>
+                          <w:color w:val="FFFFFF" w:themeColor="background1"/>
+                          <w:spacing w:val="10"/>
+                          <w:sz w:val="44"/>
+                          <w:szCs w:val="20"/>
+                          <w:lang w:eastAsia="en-IN"/>
+                          <w14:shadow w14:blurRad="63500" w14:dist="50800" w14:dir="13500000" w14:sx="0" w14:sy="0" w14:kx="0" w14:ky="0" w14:algn="none">
+                            <w14:srgbClr w14:val="000000">
+                              <w14:alpha w14:val="50000"/>
+                            </w14:srgbClr>
+                          </w14:shadow>
+                          <w14:textOutline w14:w="0" w14:cap="flat" w14:cmpd="sng" w14:algn="ctr">
+                            <w14:noFill/>
+                            <w14:prstDash w14:val="solid"/>
+                            <w14:round/>
+                          </w14:textOutline>
+                        </w:rPr>
+                      </w:pPr>
+                      <w:r>
+                        <w:rPr>
+                          <w:rFonts w:ascii="Courier New" w:eastAsia="Times New Roman" w:hAnsi="Courier New" w:cs="Courier New"/>
+                          <w:b/>
+                          <w:color w:val="FFFFFF" w:themeColor="background1"/>
+                          <w:spacing w:val="10"/>
+                          <w:sz w:val="44"/>
+                          <w:szCs w:val="20"/>
+                          <w:lang w:eastAsia="en-IN"/>
+                          <w14:shadow w14:blurRad="63500" w14:dist="50800" w14:dir="13500000" w14:sx="0" w14:sy="0" w14:kx="0" w14:ky="0" w14:algn="none">
+                            <w14:srgbClr w14:val="000000">
+                              <w14:alpha w14:val="50000"/>
+                            </w14:srgbClr>
+                          </w14:shadow>
+                          <w14:textOutline w14:w="0" w14:cap="flat" w14:cmpd="sng" w14:algn="ctr">
+                            <w14:noFill/>
+                            <w14:prstDash w14:val="solid"/>
+                            <w14:round/>
+                          </w14:textOutline>
+                        </w:rPr>
+                        <w:t xml:space="preserve">S3 RGB </w:t>
+                      </w:r>
+                      <w:r>
+                        <w:rPr>
+                          <w:rFonts w:ascii="Courier New" w:eastAsia="Times New Roman" w:hAnsi="Courier New" w:cs="Courier New"/>
+                          <w:b/>
+                          <w:color w:val="FFFFFF" w:themeColor="background1"/>
+                          <w:spacing w:val="10"/>
+                          <w:sz w:val="44"/>
+                          <w:szCs w:val="20"/>
+                          <w:lang w:eastAsia="en-IN"/>
+                          <w14:shadow w14:blurRad="63500" w14:dist="50800" w14:dir="13500000" w14:sx="0" w14:sy="0" w14:kx="0" w14:ky="0" w14:algn="none">
+                            <w14:srgbClr w14:val="000000">
+                              <w14:alpha w14:val="50000"/>
+                            </w14:srgbClr>
+                          </w14:shadow>
+                          <w14:textOutline w14:w="0" w14:cap="flat" w14:cmpd="sng" w14:algn="ctr">
+                            <w14:noFill/>
+                            <w14:prstDash w14:val="solid"/>
+                            <w14:round/>
+                          </w14:textOutline>
+                        </w:rPr>
+                        <w:t xml:space="preserve">MAC: </w:t>
+                      </w:r>
+                      <w:r>
+                        <w:rPr>
+                          <w:rFonts w:ascii="Courier New" w:eastAsia="Times New Roman" w:hAnsi="Courier New" w:cs="Courier New"/>
+                          <w:b/>
+                          <w:color w:val="FFFFFF" w:themeColor="background1"/>
+                          <w:spacing w:val="10"/>
+                          <w:sz w:val="44"/>
+                          <w:szCs w:val="20"/>
+                          <w:lang w:eastAsia="en-IN"/>
+                          <w14:shadow w14:blurRad="63500" w14:dist="50800" w14:dir="13500000" w14:sx="0" w14:sy="0" w14:kx="0" w14:ky="0" w14:algn="none">
+                            <w14:srgbClr w14:val="000000">
+                              <w14:alpha w14:val="50000"/>
+                            </w14:srgbClr>
+                          </w14:shadow>
+                          <w14:textOutline w14:w="0" w14:cap="flat" w14:cmpd="sng" w14:algn="ctr">
+                            <w14:noFill/>
+                            <w14:prstDash w14:val="solid"/>
+                            <w14:round/>
+                          </w14:textOutline>
+                        </w:rPr>
+                        <w:t>8C:94:DF:90:AB:CC</w:t>
+                      </w:r>
+                    </w:p>
+                    <w:p>
+                      <w:pPr>
+                        <w:jc w:val="center"/>
+                        <w:rPr>
+                          <w:b/>
+                          <w:color w:val="FFFFFF" w:themeColor="background1"/>
+                          <w:spacing w:val="10"/>
+                          <w:sz w:val="14"/>
+                          <w14:shadow w14:blurRad="63500" w14:dist="50800" w14:dir="13500000" w14:sx="0" w14:sy="0" w14:kx="0" w14:ky="0" w14:algn="none">
+                            <w14:srgbClr w14:val="000000">
+                              <w14:alpha w14:val="50000"/>
+                            </w14:srgbClr>
+                          </w14:shadow>
+                          <w14:textOutline w14:w="0" w14:cap="flat" w14:cmpd="sng" w14:algn="ctr">
+                            <w14:noFill/>
+                            <w14:prstDash w14:val="solid"/>
+                            <w14:round/>
+                          </w14:textOutline>
+                        </w:rPr>
+                      </w:pPr>
+                    </w:p>
+                  </w:txbxContent>
+                </v:textbox>
+              </v:roundrect>
+            </w:pict>
+          </mc:Fallback>
+        </mc:AlternateContent>
+      </w:r>
+      <w:r>
+        <w:rPr>
+          <w:noProof/>
+          <w:lang w:eastAsia="en-IN"/>
+        </w:rPr>
+        <mc:AlternateContent>
+          <mc:Choice Requires="wps">
+            <w:drawing>
+              <wp:anchor distT="0" distB="0" distL="114300" distR="114300" simplePos="0" relativeHeight="251661312" behindDoc="0" locked="0" layoutInCell="1" allowOverlap="1" wp14:anchorId="1DB6CDC3" wp14:editId="0900701C">
+                <wp:simplePos x="0" y="0"/>
+                <wp:positionH relativeFrom="column">
+                  <wp:posOffset>17813</wp:posOffset>
+                </wp:positionH>
+                <wp:positionV relativeFrom="paragraph">
+                  <wp:posOffset>1804414</wp:posOffset>
+                </wp:positionV>
+                <wp:extent cx="1952625" cy="1181100"/>
+                <wp:effectExtent l="0" t="0" r="28575" b="19050"/>
+                <wp:wrapNone/>
+                <wp:docPr id="2" name="Rounded Rectangle 2"/>
+                <wp:cNvGraphicFramePr/>
+                <a:graphic xmlns:a="http://schemas.openxmlformats.org/drawingml/2006/main">
+                  <a:graphicData uri="http://schemas.microsoft.com/office/word/2010/wordprocessingShape">
+                    <wps:wsp>
+                      <wps:cNvSpPr/>
+                      <wps:spPr>
+                        <a:xfrm>
+                          <a:off x="0" y="0"/>
+                          <a:ext cx="1952625" cy="1181100"/>
+                        </a:xfrm>
+                        <a:prstGeom prst="roundRect">
+                          <a:avLst/>
+                        </a:prstGeom>
+                        <a:ln>
+                          <a:solidFill>
+                            <a:schemeClr val="tx1"/>
+                          </a:solidFill>
+                        </a:ln>
+                      </wps:spPr>
+                      <wps:style>
+                        <a:lnRef idx="2">
+                          <a:schemeClr val="dk1">
+                            <a:shade val="50000"/>
+                          </a:schemeClr>
+                        </a:lnRef>
+                        <a:fillRef idx="1">
+                          <a:schemeClr val="dk1"/>
+                        </a:fillRef>
+                        <a:effectRef idx="0">
+                          <a:schemeClr val="dk1"/>
+                        </a:effectRef>
+                        <a:fontRef idx="minor">
+                          <a:schemeClr val="lt1"/>
+                        </a:fontRef>
+                      </wps:style>
+                      <wps:txbx>
+                        <w:txbxContent>
+                          <w:p>
+                            <w:pPr>
+                              <w:shd w:val="clear" w:color="auto" w:fill="1F272A"/>
+                              <w:tabs>
+                                <w:tab w:val="left" w:pos="916"/>
+                                <w:tab w:val="left" w:pos="1832"/>
+                                <w:tab w:val="left" w:pos="2748"/>
+                                <w:tab w:val="left" w:pos="3664"/>
+                                <w:tab w:val="left" w:pos="4580"/>
+                                <w:tab w:val="left" w:pos="5496"/>
+                                <w:tab w:val="left" w:pos="6412"/>
+                                <w:tab w:val="left" w:pos="7328"/>
+                                <w:tab w:val="left" w:pos="8244"/>
+                                <w:tab w:val="left" w:pos="9160"/>
+                                <w:tab w:val="left" w:pos="10076"/>
+                                <w:tab w:val="left" w:pos="10992"/>
+                                <w:tab w:val="left" w:pos="11908"/>
+                                <w:tab w:val="left" w:pos="12824"/>
+                                <w:tab w:val="left" w:pos="13740"/>
+                                <w:tab w:val="left" w:pos="14656"/>
+                              </w:tabs>
+                              <w:spacing w:after="0" w:line="240" w:lineRule="auto"/>
+                              <w:jc w:val="center"/>
+                              <w:rPr>
+                                <w:rFonts w:ascii="Courier New" w:eastAsia="Times New Roman" w:hAnsi="Courier New" w:cs="Courier New"/>
+                                <w:b/>
+                                <w:color w:val="FFFFFF" w:themeColor="background1"/>
+                                <w:spacing w:val="10"/>
+                                <w:sz w:val="44"/>
+                                <w:szCs w:val="20"/>
+                                <w:lang w:eastAsia="en-IN"/>
+                                <w14:shadow w14:blurRad="63500" w14:dist="50800" w14:dir="13500000" w14:sx="0" w14:sy="0" w14:kx="0" w14:ky="0" w14:algn="none">
+                                  <w14:srgbClr w14:val="000000">
+                                    <w14:alpha w14:val="50000"/>
+                                  </w14:srgbClr>
+                                </w14:shadow>
+                                <w14:textOutline w14:w="0" w14:cap="flat" w14:cmpd="sng" w14:algn="ctr">
+                                  <w14:noFill/>
+                                  <w14:prstDash w14:val="solid"/>
+                                  <w14:round/>
+                                </w14:textOutline>
+                              </w:rPr>
+                            </w:pPr>
+                            <w:r>
+                              <w:rPr>
+                                <w:rFonts w:ascii="Courier New" w:eastAsia="Times New Roman" w:hAnsi="Courier New" w:cs="Courier New"/>
+                                <w:b/>
+                                <w:color w:val="FFFFFF" w:themeColor="background1"/>
+                                <w:spacing w:val="10"/>
+                                <w:sz w:val="44"/>
+                                <w:szCs w:val="20"/>
+                                <w:lang w:eastAsia="en-IN"/>
+                                <w14:shadow w14:blurRad="63500" w14:dist="50800" w14:dir="13500000" w14:sx="0" w14:sy="0" w14:kx="0" w14:ky="0" w14:algn="none">
+                                  <w14:srgbClr w14:val="000000">
+                                    <w14:alpha w14:val="50000"/>
+                                  </w14:srgbClr>
+                                </w14:shadow>
+                                <w14:textOutline w14:w="0" w14:cap="flat" w14:cmpd="sng" w14:algn="ctr">
+                                  <w14:noFill/>
+                                  <w14:prstDash w14:val="solid"/>
+                                  <w14:round/>
+                                </w14:textOutline>
+                              </w:rPr>
+                              <w:t xml:space="preserve">S2 </w:t>
+                            </w:r>
+                            <w:r>
+                              <w:rPr>
+                                <w:rFonts w:ascii="Courier New" w:eastAsia="Times New Roman" w:hAnsi="Courier New" w:cs="Courier New"/>
+                                <w:b/>
+                                <w:color w:val="FFFFFF" w:themeColor="background1"/>
+                                <w:spacing w:val="10"/>
+                                <w:sz w:val="44"/>
+                                <w:szCs w:val="20"/>
+                                <w:lang w:eastAsia="en-IN"/>
+                                <w14:shadow w14:blurRad="63500" w14:dist="50800" w14:dir="13500000" w14:sx="0" w14:sy="0" w14:kx="0" w14:ky="0" w14:algn="none">
+                                  <w14:srgbClr w14:val="000000">
+                                    <w14:alpha w14:val="50000"/>
+                                  </w14:srgbClr>
+                                </w14:shadow>
+                                <w14:textOutline w14:w="0" w14:cap="flat" w14:cmpd="sng" w14:algn="ctr">
+                                  <w14:noFill/>
+                                  <w14:prstDash w14:val="solid"/>
+                                  <w14:round/>
+                                </w14:textOutline>
+                              </w:rPr>
+                              <w:t>MAC: 8C:94</w:t>
+                            </w:r>
+                            <w:proofErr w:type="gramStart"/>
+                            <w:r>
+                              <w:rPr>
+                                <w:rFonts w:ascii="Courier New" w:eastAsia="Times New Roman" w:hAnsi="Courier New" w:cs="Courier New"/>
+                                <w:b/>
+                                <w:color w:val="FFFFFF" w:themeColor="background1"/>
+                                <w:spacing w:val="10"/>
+                                <w:sz w:val="44"/>
+                                <w:szCs w:val="20"/>
+                                <w:lang w:eastAsia="en-IN"/>
+                                <w14:shadow w14:blurRad="63500" w14:dist="50800" w14:dir="13500000" w14:sx="0" w14:sy="0" w14:kx="0" w14:ky="0" w14:algn="none">
+                                  <w14:srgbClr w14:val="000000">
+                                    <w14:alpha w14:val="50000"/>
+                                  </w14:srgbClr>
+                                </w14:shadow>
+                                <w14:textOutline w14:w="0" w14:cap="flat" w14:cmpd="sng" w14:algn="ctr">
+                                  <w14:noFill/>
+                                  <w14:prstDash w14:val="solid"/>
+                                  <w14:round/>
+                                </w14:textOutline>
+                              </w:rPr>
+                              <w:t>:DF:46:6E:14</w:t>
+                            </w:r>
+                            <w:proofErr w:type="gramEnd"/>
+                          </w:p>
+                          <w:p>
+                            <w:pPr>
+                              <w:jc w:val="center"/>
+                              <w:rPr>
+                                <w:b/>
+                                <w:color w:val="FFFFFF" w:themeColor="background1"/>
+                                <w:spacing w:val="10"/>
+                                <w:sz w:val="14"/>
+                                <w14:shadow w14:blurRad="63500" w14:dist="50800" w14:dir="13500000" w14:sx="0" w14:sy="0" w14:kx="0" w14:ky="0" w14:algn="none">
+                                  <w14:srgbClr w14:val="000000">
+                                    <w14:alpha w14:val="50000"/>
+                                  </w14:srgbClr>
+                                </w14:shadow>
+                                <w14:textOutline w14:w="0" w14:cap="flat" w14:cmpd="sng" w14:algn="ctr">
+                                  <w14:noFill/>
+                                  <w14:prstDash w14:val="solid"/>
+                                  <w14:round/>
+                                </w14:textOutline>
+                              </w:rPr>
+                            </w:pPr>
+                          </w:p>
+                        </w:txbxContent>
+                      </wps:txbx>
+                      <wps:bodyPr rot="0" spcFirstLastPara="0" vertOverflow="overflow" horzOverflow="overflow" vert="horz" wrap="square" lIns="91440" tIns="45720" rIns="91440" bIns="45720" numCol="1" spcCol="0" rtlCol="0" fromWordArt="0" anchor="ctr" anchorCtr="0" forceAA="0" compatLnSpc="1">
+                        <a:prstTxWarp prst="textNoShape">
+                          <a:avLst/>
+                        </a:prstTxWarp>
+                        <a:noAutofit/>
+                      </wps:bodyPr>
+                    </wps:wsp>
+                  </a:graphicData>
+                </a:graphic>
+                <wp14:sizeRelH relativeFrom="margin">
+                  <wp14:pctWidth>0</wp14:pctWidth>
+                </wp14:sizeRelH>
+                <wp14:sizeRelV relativeFrom="margin">
+                  <wp14:pctHeight>0</wp14:pctHeight>
+                </wp14:sizeRelV>
+              </wp:anchor>
+            </w:drawing>
+          </mc:Choice>
+          <mc:Fallback>
+            <w:pict>
+              <v:roundrect w14:anchorId="1DB6CDC3" id="Rounded Rectangle 2" o:spid="_x0000_s1027" style="position:absolute;margin-left:1.4pt;margin-top:142.1pt;width:153.75pt;height:93pt;z-index:251661312;visibility:visible;mso-wrap-style:square;mso-width-percent:0;mso-height-percent:0;mso-wrap-distance-left:9pt;mso-wrap-distance-top:0;mso-wrap-distance-right:9pt;mso-wrap-distance-bottom:0;mso-position-horizontal:absolute;mso-position-horizontal-relative:text;mso-position-vertical:absolute;mso-position-vertical-relative:text;mso-width-percent:0;mso-height-percent:0;mso-width-relative:margin;mso-height-relative:margin;v-text-anchor:middle" arcsize="10923f" o:gfxdata="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" fillcolor="black [3200]" strokecolor="black [3213]" strokeweight="1pt">
+                <v:stroke joinstyle="miter"/>
+                <v:textbox>
+                  <w:txbxContent>
+                    <w:p>
+                      <w:pPr>
+                        <w:shd w:val="clear" w:color="auto" w:fill="1F272A"/>
+                        <w:tabs>
+                          <w:tab w:val="left" w:pos="916"/>
+                          <w:tab w:val="left" w:pos="1832"/>
+                          <w:tab w:val="left" w:pos="2748"/>
+                          <w:tab w:val="left" w:pos="3664"/>
+                          <w:tab w:val="left" w:pos="4580"/>
+                          <w:tab w:val="left" w:pos="5496"/>
+                          <w:tab w:val="left" w:pos="6412"/>
+                          <w:tab w:val="left" w:pos="7328"/>
+                          <w:tab w:val="left" w:pos="8244"/>
+                          <w:tab w:val="left" w:pos="9160"/>
+                          <w:tab w:val="left" w:pos="10076"/>
+                          <w:tab w:val="left" w:pos="10992"/>
+                          <w:tab w:val="left" w:pos="11908"/>
+                          <w:tab w:val="left" w:pos="12824"/>
+                          <w:tab w:val="left" w:pos="13740"/>
+                          <w:tab w:val="left" w:pos="14656"/>
+                        </w:tabs>
+                        <w:spacing w:after="0" w:line="240" w:lineRule="auto"/>
+                        <w:jc w:val="center"/>
+                        <w:rPr>
+                          <w:rFonts w:ascii="Courier New" w:eastAsia="Times New Roman" w:hAnsi="Courier New" w:cs="Courier New"/>
+                          <w:b/>
+                          <w:color w:val="FFFFFF" w:themeColor="background1"/>
+                          <w:spacing w:val="10"/>
+                          <w:sz w:val="44"/>
+                          <w:szCs w:val="20"/>
+                          <w:lang w:eastAsia="en-IN"/>
+                          <w14:shadow w14:blurRad="63500" w14:dist="50800" w14:dir="13500000" w14:sx="0" w14:sy="0" w14:kx="0" w14:ky="0" w14:algn="none">
+                            <w14:srgbClr w14:val="000000">
+                              <w14:alpha w14:val="50000"/>
+                            </w14:srgbClr>
+                          </w14:shadow>
+                          <w14:textOutline w14:w="0" w14:cap="flat" w14:cmpd="sng" w14:algn="ctr">
+                            <w14:noFill/>
+                            <w14:prstDash w14:val="solid"/>
+                            <w14:round/>
+                          </w14:textOutline>
+                        </w:rPr>
+                      </w:pPr>
+                      <w:r>
+                        <w:rPr>
+                          <w:rFonts w:ascii="Courier New" w:eastAsia="Times New Roman" w:hAnsi="Courier New" w:cs="Courier New"/>
+                          <w:b/>
+                          <w:color w:val="FFFFFF" w:themeColor="background1"/>
+                          <w:spacing w:val="10"/>
+                          <w:sz w:val="44"/>
+                          <w:szCs w:val="20"/>
+                          <w:lang w:eastAsia="en-IN"/>
+                          <w14:shadow w14:blurRad="63500" w14:dist="50800" w14:dir="13500000" w14:sx="0" w14:sy="0" w14:kx="0" w14:ky="0" w14:algn="none">
+                            <w14:srgbClr w14:val="000000">
+                              <w14:alpha w14:val="50000"/>
+                            </w14:srgbClr>
+                          </w14:shadow>
+                          <w14:textOutline w14:w="0" w14:cap="flat" w14:cmpd="sng" w14:algn="ctr">
+                            <w14:noFill/>
+                            <w14:prstDash w14:val="solid"/>
+                            <w14:round/>
+                          </w14:textOutline>
+                        </w:rPr>
+                        <w:t xml:space="preserve">S2 </w:t>
+                      </w:r>
+                      <w:r>
+                        <w:rPr>
+                          <w:rFonts w:ascii="Courier New" w:eastAsia="Times New Roman" w:hAnsi="Courier New" w:cs="Courier New"/>
+                          <w:b/>
+                          <w:color w:val="FFFFFF" w:themeColor="background1"/>
+                          <w:spacing w:val="10"/>
+                          <w:sz w:val="44"/>
+                          <w:szCs w:val="20"/>
+                          <w:lang w:eastAsia="en-IN"/>
+                          <w14:shadow w14:blurRad="63500" w14:dist="50800" w14:dir="13500000" w14:sx="0" w14:sy="0" w14:kx="0" w14:ky="0" w14:algn="none">
+                            <w14:srgbClr w14:val="000000">
+                              <w14:alpha w14:val="50000"/>
+                            </w14:srgbClr>
+                          </w14:shadow>
+                          <w14:textOutline w14:w="0" w14:cap="flat" w14:cmpd="sng" w14:algn="ctr">
+                            <w14:noFill/>
+                            <w14:prstDash w14:val="solid"/>
+                            <w14:round/>
+                          </w14:textOutline>
+                        </w:rPr>
+                        <w:t>MAC: 8C:94</w:t>
+                      </w:r>
+                      <w:proofErr w:type="gramStart"/>
+                      <w:r>
+                        <w:rPr>
+                          <w:rFonts w:ascii="Courier New" w:eastAsia="Times New Roman" w:hAnsi="Courier New" w:cs="Courier New"/>
+                          <w:b/>
+                          <w:color w:val="FFFFFF" w:themeColor="background1"/>
+                          <w:spacing w:val="10"/>
+                          <w:sz w:val="44"/>
+                          <w:szCs w:val="20"/>
+                          <w:lang w:eastAsia="en-IN"/>
+                          <w14:shadow w14:blurRad="63500" w14:dist="50800" w14:dir="13500000" w14:sx="0" w14:sy="0" w14:kx="0" w14:ky="0" w14:algn="none">
+                            <w14:srgbClr w14:val="000000">
+                              <w14:alpha w14:val="50000"/>
+                            </w14:srgbClr>
+                          </w14:shadow>
+                          <w14:textOutline w14:w="0" w14:cap="flat" w14:cmpd="sng" w14:algn="ctr">
+                            <w14:noFill/>
+                            <w14:prstDash w14:val="solid"/>
+                            <w14:round/>
+                          </w14:textOutline>
+                        </w:rPr>
+                        <w:t>:DF:46:6E:14</w:t>
+                      </w:r>
+                      <w:proofErr w:type="gramEnd"/>
+                    </w:p>
+                    <w:p>
+                      <w:pPr>
+                        <w:jc w:val="center"/>
+                        <w:rPr>
+                          <w:b/>
+                          <w:color w:val="FFFFFF" w:themeColor="background1"/>
+                          <w:spacing w:val="10"/>
+                          <w:sz w:val="14"/>
+                          <w14:shadow w14:blurRad="63500" w14:dist="50800" w14:dir="13500000" w14:sx="0" w14:sy="0" w14:kx="0" w14:ky="0" w14:algn="none">
+                            <w14:srgbClr w14:val="000000">
+                              <w14:alpha w14:val="50000"/>
+                            </w14:srgbClr>
+                          </w14:shadow>
+                          <w14:textOutline w14:w="0" w14:cap="flat" w14:cmpd="sng" w14:algn="ctr">
+                            <w14:noFill/>
+                            <w14:prstDash w14:val="solid"/>
+                            <w14:round/>
+                          </w14:textOutline>
+                        </w:rPr>
+                      </w:pPr>
+                    </w:p>
+                  </w:txbxContent>
+                </v:textbox>
+              </v:roundrect>
+            </w:pict>
+          </mc:Fallback>
+        </mc:AlternateContent>
+      </w:r>
       <w:r>
         <w:rPr>
           <w:noProof/>
@@ -125,6 +831,28 @@
                                   <w14:round/>
                                 </w14:textOutline>
                               </w:rPr>
+                              <w:t xml:space="preserve">S1 </w:t>
+                            </w:r>
+                            <w:r>
+                              <w:rPr>
+                                <w:rFonts w:ascii="Courier New" w:eastAsia="Times New Roman" w:hAnsi="Courier New" w:cs="Courier New"/>
+                                <w:b/>
+                                <w:color w:val="FFFFFF" w:themeColor="background1"/>
+                                <w:spacing w:val="10"/>
+                                <w:sz w:val="44"/>
+                                <w:szCs w:val="20"/>
+                                <w:lang w:eastAsia="en-IN"/>
+                                <w14:shadow w14:blurRad="63500" w14:dist="50800" w14:dir="13500000" w14:sx="0" w14:sy="0" w14:kx="0" w14:ky="0" w14:algn="none">
+                                  <w14:srgbClr w14:val="000000">
+                                    <w14:alpha w14:val="50000"/>
+                                  </w14:srgbClr>
+                                </w14:shadow>
+                                <w14:textOutline w14:w="0" w14:cap="flat" w14:cmpd="sng" w14:algn="ctr">
+                                  <w14:noFill/>
+                                  <w14:prstDash w14:val="solid"/>
+                                  <w14:round/>
+                                </w14:textOutline>
+                              </w:rPr>
                               <w:t>MAC: 28:05:A5:34:62:78</w:t>
                             </w:r>
                           </w:p>
@@ -171,7 +899,7 @@
           </mc:Choice>
           <mc:Fallback>
             <w:pict>
-              <v:roundrect id="Rounded Rectangle 1" o:spid="_x0000_s1026" style="position:absolute;margin-left:1.5pt;margin-top:21.25pt;width:153.75pt;height:93pt;z-index:251659264;visibility:visible;mso-wrap-style:square;mso-width-percent:0;mso-height-percent:0;mso-wrap-distance-left:9pt;mso-wrap-distance-top:0;mso-wrap-distance-right:9pt;mso-wrap-distance-bottom:0;mso-position-horizontal:absolute;mso-position-horizontal-relative:text;mso-position-vertical:absolute;mso-position-vertical-relative:text;mso-width-percent:0;mso-height-percent:0;mso-width-relative:margin;mso-height-relative:margin;v-text-anchor:middle" arcsize="10923f" o:gfxdata="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" fillcolor="black [3200]" strokecolor="black [3213]" strokeweight="1pt">
+              <v:roundrect id="Rounded Rectangle 1" o:spid="_x0000_s1028" style="position:absolute;margin-left:1.5pt;margin-top:21.25pt;width:153.75pt;height:93pt;z-index:251659264;visibility:visible;mso-wrap-style:square;mso-width-percent:0;mso-height-percent:0;mso-wrap-distance-left:9pt;mso-wrap-distance-top:0;mso-wrap-distance-right:9pt;mso-wrap-distance-bottom:0;mso-position-horizontal:absolute;mso-position-horizontal-relative:text;mso-position-vertical:absolute;mso-position-vertical-relative:text;mso-width-percent:0;mso-height-percent:0;mso-width-relative:margin;mso-height-relative:margin;v-text-anchor:middle" arcsize="10923f" o:gfxdata="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" fillcolor="black [3200]" strokecolor="black [3213]" strokeweight="1pt">
                 <v:stroke joinstyle="miter"/>
                 <v:textbox>
                   <w:txbxContent>
@@ -218,6 +946,28 @@
                           </w14:textOutline>
                         </w:rPr>
                       </w:pPr>
+                      <w:r>
+                        <w:rPr>
+                          <w:rFonts w:ascii="Courier New" w:eastAsia="Times New Roman" w:hAnsi="Courier New" w:cs="Courier New"/>
+                          <w:b/>
+                          <w:color w:val="FFFFFF" w:themeColor="background1"/>
+                          <w:spacing w:val="10"/>
+                          <w:sz w:val="44"/>
+                          <w:szCs w:val="20"/>
+                          <w:lang w:eastAsia="en-IN"/>
+                          <w14:shadow w14:blurRad="63500" w14:dist="50800" w14:dir="13500000" w14:sx="0" w14:sy="0" w14:kx="0" w14:ky="0" w14:algn="none">
+                            <w14:srgbClr w14:val="000000">
+                              <w14:alpha w14:val="50000"/>
+                            </w14:srgbClr>
+                          </w14:shadow>
+                          <w14:textOutline w14:w="0" w14:cap="flat" w14:cmpd="sng" w14:algn="ctr">
+                            <w14:noFill/>
+                            <w14:prstDash w14:val="solid"/>
+                            <w14:round/>
+                          </w14:textOutline>
+                        </w:rPr>
+                        <w:t xml:space="preserve">S1 </w:t>
+                      </w:r>
                       <w:r>
                         <w:rPr>
                           <w:rFonts w:ascii="Courier New" w:eastAsia="Times New Roman" w:hAnsi="Courier New" w:cs="Courier New"/>
@@ -677,6 +1427,7 @@
   <w:style w:type="paragraph" w:default="1" w:styleId="Normal">
     <w:name w:val="Normal"/>
     <w:qFormat/>
+    <w:rsid w:val="00F12727"/>
   </w:style>
   <w:style w:type="character" w:default="1" w:styleId="DefaultParagraphFont">
     <w:name w:val="Default Paragraph Font"/>

</xml_diff>